<commit_message>
Manuscript supplement: report post-QC results only
Co-Authored-By: Claude Fable 5.1 <noreply@anthropic.com>
</commit_message>
<xml_diff>
--- a/NatGenet_sections_2026-10-26.docx
+++ b/NatGenet_sections_2026-10-26.docx
@@ -1470,7 +1470,7 @@
           <w:noProof/>
         </w:rPr>
         <w:drawing>
-          <wp:inline distT="0" distB="0" distL="0" distR="0" wp14:anchorId="2E1A05B0" wp14:editId="3758EC95">
+          <wp:inline distT="0" distB="0" distL="0" distR="0" wp14:anchorId="526B1753" wp14:editId="716AA823">
             <wp:extent cx="4937760" cy="6326505"/>
             <wp:effectExtent l="0" t="0" r="0" b="0"/>
             <wp:docPr id="1" name="Picture 1"/>
@@ -1962,7 +1962,7 @@
           <w:sz w:val="20"/>
           <w:szCs w:val="20"/>
         </w:rPr>
-        <w:t xml:space="preserve"> values are reported without adjustment for multiple comparisons; the heterogeneity tests and the sensitivity analyses in the Supplementary Information address the specificity of the findings. Sample sizes are given in the figure legend and in Supplementary Tables 1 and 2; no statistical method was used to predetermine sample size.</w:t>
+        <w:t xml:space="preserve"> values are reported without adjustment for multiple comparisons; the heterogeneity tests and the sensitivity analyses in the Supplementary Information address the specificity of the findings. The CNV x age x BMI terms are sensitive to extreme observations and are reported as exploratory. Sample sizes are given in the figure legend and in Supplementary Tables 1 and 2; no statistical method was used to predetermine sample size.</w:t>
       </w:r>
     </w:p>
     <w:p>
@@ -2684,7 +2684,30 @@
           <w:sz w:val="20"/>
           <w:szCs w:val="20"/>
         </w:rPr>
-        <w:t xml:space="preserve"> = 0.11). The negative slope in 16p11.2 duplication carriers had been nominally significant (-0.15, </w:t>
+        <w:t xml:space="preserve"> = 0.11). (Supplementary Figs. 2 and 3, Supplementary Table 2).</w:t>
+      </w:r>
+    </w:p>
+    <w:p>
+      <w:r>
+        <w:rPr>
+          <w:rFonts w:ascii="Cambria" w:eastAsia="Cambria" w:hAnsi="Cambria" w:cs="Cambria"/>
+          <w:b/>
+          <w:color w:val="000000"/>
+          <w:sz w:val="20"/>
+          <w:szCs w:val="20"/>
+        </w:rPr>
+        <w:t>Sex and polygenic background</w:t>
+      </w:r>
+    </w:p>
+    <w:p>
+      <w:r>
+        <w:rPr>
+          <w:rFonts w:ascii="Cambria" w:eastAsia="Cambria" w:hAnsi="Cambria" w:cs="Cambria"/>
+          <w:color w:val="000000"/>
+          <w:sz w:val="20"/>
+          <w:szCs w:val="20"/>
+        </w:rPr>
+        <w:t xml:space="preserve">In the subset with polygenic scores (G2MH carriers and SSC controls), the CNV x BMI contrasts were essentially unchanged by adjustment for sex, for each polygenic score with its BMI interaction, for all four scores, or for all four plus sex, on the same individuals: SRS, all CNVs, +0.192 (s.e. 0.048, </w:t>
       </w:r>
       <w:r>
         <w:rPr>
@@ -2703,7 +2726,7 @@
           <w:sz w:val="20"/>
           <w:szCs w:val="20"/>
         </w:rPr>
-        <w:t xml:space="preserve"> = 0.015) before the plausibility screen and rested on a single carrier with a recorded BMI of 9.2 kg m</w:t>
+        <w:t xml:space="preserve"> = 5.8 x 10</w:t>
       </w:r>
       <w:r>
         <w:rPr>
@@ -2713,16 +2736,225 @@
           <w:szCs w:val="20"/>
           <w:vertAlign w:val="superscript"/>
         </w:rPr>
-        <w:t>-2</w:t>
-      </w:r>
-      <w:r>
-        <w:rPr>
-          <w:rFonts w:ascii="Cambria" w:eastAsia="Cambria" w:hAnsi="Cambria" w:cs="Cambria"/>
-          <w:color w:val="000000"/>
-          <w:sz w:val="20"/>
-          <w:szCs w:val="20"/>
-        </w:rPr>
-        <w:t xml:space="preserve"> (Supplementary Figs. 2 and 3, Supplementary Table 2).</w:t>
+        <w:t>-5</w:t>
+      </w:r>
+      <w:r>
+        <w:rPr>
+          <w:rFonts w:ascii="Cambria" w:eastAsia="Cambria" w:hAnsi="Cambria" w:cs="Cambria"/>
+          <w:color w:val="000000"/>
+          <w:sz w:val="20"/>
+          <w:szCs w:val="20"/>
+        </w:rPr>
+        <w:t>) unadjusted and +0.198 (</w:t>
+      </w:r>
+      <w:r>
+        <w:rPr>
+          <w:rFonts w:ascii="Cambria" w:eastAsia="Cambria" w:hAnsi="Cambria" w:cs="Cambria"/>
+          <w:i/>
+          <w:color w:val="000000"/>
+          <w:sz w:val="20"/>
+          <w:szCs w:val="20"/>
+        </w:rPr>
+        <w:t>P</w:t>
+      </w:r>
+      <w:r>
+        <w:rPr>
+          <w:rFonts w:ascii="Cambria" w:eastAsia="Cambria" w:hAnsi="Cambria" w:cs="Cambria"/>
+          <w:color w:val="000000"/>
+          <w:sz w:val="20"/>
+          <w:szCs w:val="20"/>
+        </w:rPr>
+        <w:t xml:space="preserve"> = 3.6 x 10</w:t>
+      </w:r>
+      <w:r>
+        <w:rPr>
+          <w:rFonts w:ascii="Cambria" w:eastAsia="Cambria" w:hAnsi="Cambria" w:cs="Cambria"/>
+          <w:color w:val="000000"/>
+          <w:sz w:val="20"/>
+          <w:szCs w:val="20"/>
+          <w:vertAlign w:val="superscript"/>
+        </w:rPr>
+        <w:t>-5</w:t>
+      </w:r>
+      <w:r>
+        <w:rPr>
+          <w:rFonts w:ascii="Cambria" w:eastAsia="Cambria" w:hAnsi="Cambria" w:cs="Cambria"/>
+          <w:color w:val="000000"/>
+          <w:sz w:val="20"/>
+          <w:szCs w:val="20"/>
+        </w:rPr>
+        <w:t>) fully adjusted; SCQ, all CNVs, +0.318 (</w:t>
+      </w:r>
+      <w:r>
+        <w:rPr>
+          <w:rFonts w:ascii="Cambria" w:eastAsia="Cambria" w:hAnsi="Cambria" w:cs="Cambria"/>
+          <w:i/>
+          <w:color w:val="000000"/>
+          <w:sz w:val="20"/>
+          <w:szCs w:val="20"/>
+        </w:rPr>
+        <w:t>P</w:t>
+      </w:r>
+      <w:r>
+        <w:rPr>
+          <w:rFonts w:ascii="Cambria" w:eastAsia="Cambria" w:hAnsi="Cambria" w:cs="Cambria"/>
+          <w:color w:val="000000"/>
+          <w:sz w:val="20"/>
+          <w:szCs w:val="20"/>
+        </w:rPr>
+        <w:t xml:space="preserve"> = 5.0 x 10</w:t>
+      </w:r>
+      <w:r>
+        <w:rPr>
+          <w:rFonts w:ascii="Cambria" w:eastAsia="Cambria" w:hAnsi="Cambria" w:cs="Cambria"/>
+          <w:color w:val="000000"/>
+          <w:sz w:val="20"/>
+          <w:szCs w:val="20"/>
+          <w:vertAlign w:val="superscript"/>
+        </w:rPr>
+        <w:t>-4</w:t>
+      </w:r>
+      <w:r>
+        <w:rPr>
+          <w:rFonts w:ascii="Cambria" w:eastAsia="Cambria" w:hAnsi="Cambria" w:cs="Cambria"/>
+          <w:color w:val="000000"/>
+          <w:sz w:val="20"/>
+          <w:szCs w:val="20"/>
+        </w:rPr>
+        <w:t>) and +0.312 (</w:t>
+      </w:r>
+      <w:r>
+        <w:rPr>
+          <w:rFonts w:ascii="Cambria" w:eastAsia="Cambria" w:hAnsi="Cambria" w:cs="Cambria"/>
+          <w:i/>
+          <w:color w:val="000000"/>
+          <w:sz w:val="20"/>
+          <w:szCs w:val="20"/>
+        </w:rPr>
+        <w:t>P</w:t>
+      </w:r>
+      <w:r>
+        <w:rPr>
+          <w:rFonts w:ascii="Cambria" w:eastAsia="Cambria" w:hAnsi="Cambria" w:cs="Cambria"/>
+          <w:color w:val="000000"/>
+          <w:sz w:val="20"/>
+          <w:szCs w:val="20"/>
+        </w:rPr>
+        <w:t xml:space="preserve"> = 7.1 x 10</w:t>
+      </w:r>
+      <w:r>
+        <w:rPr>
+          <w:rFonts w:ascii="Cambria" w:eastAsia="Cambria" w:hAnsi="Cambria" w:cs="Cambria"/>
+          <w:color w:val="000000"/>
+          <w:sz w:val="20"/>
+          <w:szCs w:val="20"/>
+          <w:vertAlign w:val="superscript"/>
+        </w:rPr>
+        <w:t>-4</w:t>
+      </w:r>
+      <w:r>
+        <w:rPr>
+          <w:rFonts w:ascii="Cambria" w:eastAsia="Cambria" w:hAnsi="Cambria" w:cs="Cambria"/>
+          <w:color w:val="000000"/>
+          <w:sz w:val="20"/>
+          <w:szCs w:val="20"/>
+        </w:rPr>
+        <w:t>); head circumference, 16p11.2 deletion, +0.130 (</w:t>
+      </w:r>
+      <w:r>
+        <w:rPr>
+          <w:rFonts w:ascii="Cambria" w:eastAsia="Cambria" w:hAnsi="Cambria" w:cs="Cambria"/>
+          <w:i/>
+          <w:color w:val="000000"/>
+          <w:sz w:val="20"/>
+          <w:szCs w:val="20"/>
+        </w:rPr>
+        <w:t>P</w:t>
+      </w:r>
+      <w:r>
+        <w:rPr>
+          <w:rFonts w:ascii="Cambria" w:eastAsia="Cambria" w:hAnsi="Cambria" w:cs="Cambria"/>
+          <w:color w:val="000000"/>
+          <w:sz w:val="20"/>
+          <w:szCs w:val="20"/>
+        </w:rPr>
+        <w:t xml:space="preserve"> = 0.086; weaker than in the full sample because Simons VIP, Searchlight and Cardiff carriers are unscored) and +0.151 (</w:t>
+      </w:r>
+      <w:r>
+        <w:rPr>
+          <w:rFonts w:ascii="Cambria" w:eastAsia="Cambria" w:hAnsi="Cambria" w:cs="Cambria"/>
+          <w:i/>
+          <w:color w:val="000000"/>
+          <w:sz w:val="20"/>
+          <w:szCs w:val="20"/>
+        </w:rPr>
+        <w:t>P</w:t>
+      </w:r>
+      <w:r>
+        <w:rPr>
+          <w:rFonts w:ascii="Cambria" w:eastAsia="Cambria" w:hAnsi="Cambria" w:cs="Cambria"/>
+          <w:color w:val="000000"/>
+          <w:sz w:val="20"/>
+          <w:szCs w:val="20"/>
+        </w:rPr>
+        <w:t xml:space="preserve"> = 0.041) (Supplementary Table 5). The carrier-versus-control slopes were present in both sexes and in both halves of every polygenic-score split (Supplementary Table 4). Of 206 modifier x BMI interaction tests, 47 had at least 80% power to detect an interaction as large as the carriers' own BMI effect; eleven were nominally significant (about two expected by chance, although the tests are correlated) and none survived correction for 47 tests (smallest </w:t>
+      </w:r>
+      <w:r>
+        <w:rPr>
+          <w:rFonts w:ascii="Cambria" w:eastAsia="Cambria" w:hAnsi="Cambria" w:cs="Cambria"/>
+          <w:i/>
+          <w:color w:val="000000"/>
+          <w:sz w:val="20"/>
+          <w:szCs w:val="20"/>
+        </w:rPr>
+        <w:t>P</w:t>
+      </w:r>
+      <w:r>
+        <w:rPr>
+          <w:rFonts w:ascii="Cambria" w:eastAsia="Cambria" w:hAnsi="Cambria" w:cs="Cambria"/>
+          <w:color w:val="000000"/>
+          <w:sz w:val="20"/>
+          <w:szCs w:val="20"/>
+        </w:rPr>
+        <w:t xml:space="preserve"> = 0.017). The only directionally consistent signal was a stronger BMI-growth coupling with higher adult-BMI polygenic score (height, all CNVs, +0.088 per s.d. of score, </w:t>
+      </w:r>
+      <w:r>
+        <w:rPr>
+          <w:rFonts w:ascii="Cambria" w:eastAsia="Cambria" w:hAnsi="Cambria" w:cs="Cambria"/>
+          <w:i/>
+          <w:color w:val="000000"/>
+          <w:sz w:val="20"/>
+          <w:szCs w:val="20"/>
+        </w:rPr>
+        <w:t>P</w:t>
+      </w:r>
+      <w:r>
+        <w:rPr>
+          <w:rFonts w:ascii="Cambria" w:eastAsia="Cambria" w:hAnsi="Cambria" w:cs="Cambria"/>
+          <w:color w:val="000000"/>
+          <w:sz w:val="20"/>
+          <w:szCs w:val="20"/>
+        </w:rPr>
+        <w:t xml:space="preserve"> = 0.017; head circumference +0.089, </w:t>
+      </w:r>
+      <w:r>
+        <w:rPr>
+          <w:rFonts w:ascii="Cambria" w:eastAsia="Cambria" w:hAnsi="Cambria" w:cs="Cambria"/>
+          <w:i/>
+          <w:color w:val="000000"/>
+          <w:sz w:val="20"/>
+          <w:szCs w:val="20"/>
+        </w:rPr>
+        <w:t>P</w:t>
+      </w:r>
+      <w:r>
+        <w:rPr>
+          <w:rFonts w:ascii="Cambria" w:eastAsia="Cambria" w:hAnsi="Cambria" w:cs="Cambria"/>
+          <w:color w:val="000000"/>
+          <w:sz w:val="20"/>
+          <w:szCs w:val="20"/>
+        </w:rPr>
+        <w:t xml:space="preserve"> = 0.031) (Supplementary Table 6).</w:t>
       </w:r>
     </w:p>
     <w:p>
@@ -2734,18 +2966,18 @@
           <w:sz w:val="20"/>
           <w:szCs w:val="20"/>
         </w:rPr>
-        <w:t>Sex and polygenic background</w:t>
-      </w:r>
-    </w:p>
-    <w:p>
-      <w:r>
-        <w:rPr>
-          <w:rFonts w:ascii="Cambria" w:eastAsia="Cambria" w:hAnsi="Cambria" w:cs="Cambria"/>
-          <w:color w:val="000000"/>
-          <w:sz w:val="20"/>
-          <w:szCs w:val="20"/>
-        </w:rPr>
-        <w:t xml:space="preserve">In the subset with polygenic scores (G2MH carriers and SSC controls), the CNV x BMI contrasts were essentially unchanged by adjustment for sex, for each polygenic score with its BMI interaction, for all four scores, or for all four plus sex, on the same individuals: SRS, all CNVs, +0.192 (s.e. 0.048, </w:t>
+        <w:t>Psychotropic medication</w:t>
+      </w:r>
+    </w:p>
+    <w:p>
+      <w:r>
+        <w:rPr>
+          <w:rFonts w:ascii="Cambria" w:eastAsia="Cambria" w:hAnsi="Cambria" w:cs="Cambria"/>
+          <w:color w:val="000000"/>
+          <w:sz w:val="20"/>
+          <w:szCs w:val="20"/>
+        </w:rPr>
+        <w:t xml:space="preserve">Current psychotropic medication was recorded for 85-92% of G2MH carriers and used by 29-33% (antipsychotics 5-7%). Medication classes were strongly associated with the traits (antipsychotic users: SRS +2.3 s.d., SCQ +3.5 s.d., CNB accuracy -0.6 s.d.) but not with BMI (antipsychotics -0.2 s.d., </w:t>
       </w:r>
       <w:r>
         <w:rPr>
@@ -2764,26 +2996,7 @@
           <w:sz w:val="20"/>
           <w:szCs w:val="20"/>
         </w:rPr>
-        <w:t xml:space="preserve"> = 5.8 x 10</w:t>
-      </w:r>
-      <w:r>
-        <w:rPr>
-          <w:rFonts w:ascii="Cambria" w:eastAsia="Cambria" w:hAnsi="Cambria" w:cs="Cambria"/>
-          <w:color w:val="000000"/>
-          <w:sz w:val="20"/>
-          <w:szCs w:val="20"/>
-          <w:vertAlign w:val="superscript"/>
-        </w:rPr>
-        <w:t>-5</w:t>
-      </w:r>
-      <w:r>
-        <w:rPr>
-          <w:rFonts w:ascii="Cambria" w:eastAsia="Cambria" w:hAnsi="Cambria" w:cs="Cambria"/>
-          <w:color w:val="000000"/>
-          <w:sz w:val="20"/>
-          <w:szCs w:val="20"/>
-        </w:rPr>
-        <w:t>) unadjusted and +0.198 (</w:t>
+        <w:t xml:space="preserve"> = 0.5; any psychotropic +0.3, </w:t>
       </w:r>
       <w:r>
         <w:rPr>
@@ -2802,300 +3015,7 @@
           <w:sz w:val="20"/>
           <w:szCs w:val="20"/>
         </w:rPr>
-        <w:t xml:space="preserve"> = 3.6 x 10</w:t>
-      </w:r>
-      <w:r>
-        <w:rPr>
-          <w:rFonts w:ascii="Cambria" w:eastAsia="Cambria" w:hAnsi="Cambria" w:cs="Cambria"/>
-          <w:color w:val="000000"/>
-          <w:sz w:val="20"/>
-          <w:szCs w:val="20"/>
-          <w:vertAlign w:val="superscript"/>
-        </w:rPr>
-        <w:t>-5</w:t>
-      </w:r>
-      <w:r>
-        <w:rPr>
-          <w:rFonts w:ascii="Cambria" w:eastAsia="Cambria" w:hAnsi="Cambria" w:cs="Cambria"/>
-          <w:color w:val="000000"/>
-          <w:sz w:val="20"/>
-          <w:szCs w:val="20"/>
-        </w:rPr>
-        <w:t>) fully adjusted; SCQ, all CNVs, +0.318 (</w:t>
-      </w:r>
-      <w:r>
-        <w:rPr>
-          <w:rFonts w:ascii="Cambria" w:eastAsia="Cambria" w:hAnsi="Cambria" w:cs="Cambria"/>
-          <w:i/>
-          <w:color w:val="000000"/>
-          <w:sz w:val="20"/>
-          <w:szCs w:val="20"/>
-        </w:rPr>
-        <w:t>P</w:t>
-      </w:r>
-      <w:r>
-        <w:rPr>
-          <w:rFonts w:ascii="Cambria" w:eastAsia="Cambria" w:hAnsi="Cambria" w:cs="Cambria"/>
-          <w:color w:val="000000"/>
-          <w:sz w:val="20"/>
-          <w:szCs w:val="20"/>
-        </w:rPr>
-        <w:t xml:space="preserve"> = 5.0 x 10</w:t>
-      </w:r>
-      <w:r>
-        <w:rPr>
-          <w:rFonts w:ascii="Cambria" w:eastAsia="Cambria" w:hAnsi="Cambria" w:cs="Cambria"/>
-          <w:color w:val="000000"/>
-          <w:sz w:val="20"/>
-          <w:szCs w:val="20"/>
-          <w:vertAlign w:val="superscript"/>
-        </w:rPr>
-        <w:t>-4</w:t>
-      </w:r>
-      <w:r>
-        <w:rPr>
-          <w:rFonts w:ascii="Cambria" w:eastAsia="Cambria" w:hAnsi="Cambria" w:cs="Cambria"/>
-          <w:color w:val="000000"/>
-          <w:sz w:val="20"/>
-          <w:szCs w:val="20"/>
-        </w:rPr>
-        <w:t>) and +0.312 (</w:t>
-      </w:r>
-      <w:r>
-        <w:rPr>
-          <w:rFonts w:ascii="Cambria" w:eastAsia="Cambria" w:hAnsi="Cambria" w:cs="Cambria"/>
-          <w:i/>
-          <w:color w:val="000000"/>
-          <w:sz w:val="20"/>
-          <w:szCs w:val="20"/>
-        </w:rPr>
-        <w:t>P</w:t>
-      </w:r>
-      <w:r>
-        <w:rPr>
-          <w:rFonts w:ascii="Cambria" w:eastAsia="Cambria" w:hAnsi="Cambria" w:cs="Cambria"/>
-          <w:color w:val="000000"/>
-          <w:sz w:val="20"/>
-          <w:szCs w:val="20"/>
-        </w:rPr>
-        <w:t xml:space="preserve"> = 7.1 x 10</w:t>
-      </w:r>
-      <w:r>
-        <w:rPr>
-          <w:rFonts w:ascii="Cambria" w:eastAsia="Cambria" w:hAnsi="Cambria" w:cs="Cambria"/>
-          <w:color w:val="000000"/>
-          <w:sz w:val="20"/>
-          <w:szCs w:val="20"/>
-          <w:vertAlign w:val="superscript"/>
-        </w:rPr>
-        <w:t>-4</w:t>
-      </w:r>
-      <w:r>
-        <w:rPr>
-          <w:rFonts w:ascii="Cambria" w:eastAsia="Cambria" w:hAnsi="Cambria" w:cs="Cambria"/>
-          <w:color w:val="000000"/>
-          <w:sz w:val="20"/>
-          <w:szCs w:val="20"/>
-        </w:rPr>
-        <w:t>); head circumference, 16p11.2 deletion, +0.130 (</w:t>
-      </w:r>
-      <w:r>
-        <w:rPr>
-          <w:rFonts w:ascii="Cambria" w:eastAsia="Cambria" w:hAnsi="Cambria" w:cs="Cambria"/>
-          <w:i/>
-          <w:color w:val="000000"/>
-          <w:sz w:val="20"/>
-          <w:szCs w:val="20"/>
-        </w:rPr>
-        <w:t>P</w:t>
-      </w:r>
-      <w:r>
-        <w:rPr>
-          <w:rFonts w:ascii="Cambria" w:eastAsia="Cambria" w:hAnsi="Cambria" w:cs="Cambria"/>
-          <w:color w:val="000000"/>
-          <w:sz w:val="20"/>
-          <w:szCs w:val="20"/>
-        </w:rPr>
-        <w:t xml:space="preserve"> = 0.086; weaker than in the full sample because Simons VIP, Searchlight and Cardiff carriers are unscored) and +0.151 (</w:t>
-      </w:r>
-      <w:r>
-        <w:rPr>
-          <w:rFonts w:ascii="Cambria" w:eastAsia="Cambria" w:hAnsi="Cambria" w:cs="Cambria"/>
-          <w:i/>
-          <w:color w:val="000000"/>
-          <w:sz w:val="20"/>
-          <w:szCs w:val="20"/>
-        </w:rPr>
-        <w:t>P</w:t>
-      </w:r>
-      <w:r>
-        <w:rPr>
-          <w:rFonts w:ascii="Cambria" w:eastAsia="Cambria" w:hAnsi="Cambria" w:cs="Cambria"/>
-          <w:color w:val="000000"/>
-          <w:sz w:val="20"/>
-          <w:szCs w:val="20"/>
-        </w:rPr>
-        <w:t xml:space="preserve"> = 0.041) (Supplementary Table 5). The carrier-versus-control slopes were present in both sexes and in both halves of every polygenic-score split (Supplementary Table 4). Of 206 modifier x BMI interaction tests, 47 had at least 80% power to detect an interaction as large as the carriers' own BMI effect; eleven were nominally significant (about two expected by chance, although the tests are correlated) and none survived correction for 47 tests (smallest </w:t>
-      </w:r>
-      <w:r>
-        <w:rPr>
-          <w:rFonts w:ascii="Cambria" w:eastAsia="Cambria" w:hAnsi="Cambria" w:cs="Cambria"/>
-          <w:i/>
-          <w:color w:val="000000"/>
-          <w:sz w:val="20"/>
-          <w:szCs w:val="20"/>
-        </w:rPr>
-        <w:t>P</w:t>
-      </w:r>
-      <w:r>
-        <w:rPr>
-          <w:rFonts w:ascii="Cambria" w:eastAsia="Cambria" w:hAnsi="Cambria" w:cs="Cambria"/>
-          <w:color w:val="000000"/>
-          <w:sz w:val="20"/>
-          <w:szCs w:val="20"/>
-        </w:rPr>
-        <w:t xml:space="preserve"> = 0.017). The only directionally consistent signal was a stronger BMI-growth coupling with higher adult-BMI polygenic score (height, all CNVs, +0.088 per s.d. of score, </w:t>
-      </w:r>
-      <w:r>
-        <w:rPr>
-          <w:rFonts w:ascii="Cambria" w:eastAsia="Cambria" w:hAnsi="Cambria" w:cs="Cambria"/>
-          <w:i/>
-          <w:color w:val="000000"/>
-          <w:sz w:val="20"/>
-          <w:szCs w:val="20"/>
-        </w:rPr>
-        <w:t>P</w:t>
-      </w:r>
-      <w:r>
-        <w:rPr>
-          <w:rFonts w:ascii="Cambria" w:eastAsia="Cambria" w:hAnsi="Cambria" w:cs="Cambria"/>
-          <w:color w:val="000000"/>
-          <w:sz w:val="20"/>
-          <w:szCs w:val="20"/>
-        </w:rPr>
-        <w:t xml:space="preserve"> = 0.017; head circumference +0.089, </w:t>
-      </w:r>
-      <w:r>
-        <w:rPr>
-          <w:rFonts w:ascii="Cambria" w:eastAsia="Cambria" w:hAnsi="Cambria" w:cs="Cambria"/>
-          <w:i/>
-          <w:color w:val="000000"/>
-          <w:sz w:val="20"/>
-          <w:szCs w:val="20"/>
-        </w:rPr>
-        <w:t>P</w:t>
-      </w:r>
-      <w:r>
-        <w:rPr>
-          <w:rFonts w:ascii="Cambria" w:eastAsia="Cambria" w:hAnsi="Cambria" w:cs="Cambria"/>
-          <w:color w:val="000000"/>
-          <w:sz w:val="20"/>
-          <w:szCs w:val="20"/>
-        </w:rPr>
-        <w:t xml:space="preserve"> = 0.031) (Supplementary Table 6).</w:t>
-      </w:r>
-    </w:p>
-    <w:p>
-      <w:r>
-        <w:rPr>
-          <w:rFonts w:ascii="Cambria" w:eastAsia="Cambria" w:hAnsi="Cambria" w:cs="Cambria"/>
-          <w:b/>
-          <w:color w:val="000000"/>
-          <w:sz w:val="20"/>
-          <w:szCs w:val="20"/>
-        </w:rPr>
-        <w:t>Psychotropic medication</w:t>
-      </w:r>
-    </w:p>
-    <w:p>
-      <w:r>
-        <w:rPr>
-          <w:rFonts w:ascii="Cambria" w:eastAsia="Cambria" w:hAnsi="Cambria" w:cs="Cambria"/>
-          <w:color w:val="000000"/>
-          <w:sz w:val="20"/>
-          <w:szCs w:val="20"/>
-        </w:rPr>
-        <w:t xml:space="preserve">Current psychotropic medication was recorded for 85-92% of G2MH carriers and used by 29-33% (antipsychotics 5-7%). Medication classes were strongly associated with the traits (antipsychotic users: SRS +2.3 s.d., SCQ +3.5 s.d., CNB accuracy -0.6 s.d.) but not with BMI (antipsychotics -0.2 s.d., </w:t>
-      </w:r>
-      <w:r>
-        <w:rPr>
-          <w:rFonts w:ascii="Cambria" w:eastAsia="Cambria" w:hAnsi="Cambria" w:cs="Cambria"/>
-          <w:i/>
-          <w:color w:val="000000"/>
-          <w:sz w:val="20"/>
-          <w:szCs w:val="20"/>
-        </w:rPr>
-        <w:t>P</w:t>
-      </w:r>
-      <w:r>
-        <w:rPr>
-          <w:rFonts w:ascii="Cambria" w:eastAsia="Cambria" w:hAnsi="Cambria" w:cs="Cambria"/>
-          <w:color w:val="000000"/>
-          <w:sz w:val="20"/>
-          <w:szCs w:val="20"/>
-        </w:rPr>
-        <w:t xml:space="preserve"> = 0.5; any psychotropic +0.3, </w:t>
-      </w:r>
-      <w:r>
-        <w:rPr>
-          <w:rFonts w:ascii="Cambria" w:eastAsia="Cambria" w:hAnsi="Cambria" w:cs="Cambria"/>
-          <w:i/>
-          <w:color w:val="000000"/>
-          <w:sz w:val="20"/>
-          <w:szCs w:val="20"/>
-        </w:rPr>
-        <w:t>P</w:t>
-      </w:r>
-      <w:r>
-        <w:rPr>
-          <w:rFonts w:ascii="Cambria" w:eastAsia="Cambria" w:hAnsi="Cambria" w:cs="Cambria"/>
-          <w:color w:val="000000"/>
-          <w:sz w:val="20"/>
-          <w:szCs w:val="20"/>
-        </w:rPr>
         <w:t xml:space="preserve"> = 0.09), and the within-carrier BMI slopes were unchanged by adjustment for medication classes or by restriction to unmedicated carriers: SRS, all CNVs, +0.22, +0.19 and +0.23; SCQ +0.35, +0.37 and +0.38; head circumference, 16p11.2 deletion, +0.47, +0.48 and +0.50; height, 16p11.2 deletion, +0.31, +0.32 and +0.27 (Supplementary Table 9).</w:t>
-      </w:r>
-    </w:p>
-    <w:p>
-      <w:r>
-        <w:rPr>
-          <w:rFonts w:ascii="Cambria" w:eastAsia="Cambria" w:hAnsi="Cambria" w:cs="Cambria"/>
-          <w:b/>
-          <w:color w:val="000000"/>
-          <w:sz w:val="20"/>
-          <w:szCs w:val="20"/>
-        </w:rPr>
-        <w:t>Effect of the plausibility screen</w:t>
-      </w:r>
-    </w:p>
-    <w:p>
-      <w:r>
-        <w:rPr>
-          <w:rFonts w:ascii="Cambria" w:eastAsia="Cambria" w:hAnsi="Cambria" w:cs="Cambria"/>
-          <w:color w:val="000000"/>
-          <w:sz w:val="20"/>
-          <w:szCs w:val="20"/>
-        </w:rPr>
-        <w:t xml:space="preserve">Screening removed 106 visit records from 95 individuals. SRS, SCQ and head-circumference results changed by at most 0.03 s.d. per s.d.; the 16p11.2 duplication CNB accuracy slope and the across-CNV heterogeneity for CNB accuracy lost significance; several CNV x age x BMI (three-way) </w:t>
-      </w:r>
-      <w:r>
-        <w:rPr>
-          <w:rFonts w:ascii="Cambria" w:eastAsia="Cambria" w:hAnsi="Cambria" w:cs="Cambria"/>
-          <w:i/>
-          <w:color w:val="000000"/>
-          <w:sz w:val="20"/>
-          <w:szCs w:val="20"/>
-        </w:rPr>
-        <w:t>P</w:t>
-      </w:r>
-      <w:r>
-        <w:rPr>
-          <w:rFonts w:ascii="Cambria" w:eastAsia="Cambria" w:hAnsi="Cambria" w:cs="Cambria"/>
-          <w:color w:val="000000"/>
-          <w:sz w:val="20"/>
-          <w:szCs w:val="20"/>
-        </w:rPr>
-        <w:t xml:space="preserve"> values for height moved by orders of magnitude in both directions, so these terms are reported in Supplementary Table 1 but not interpreted.</w:t>
       </w:r>
     </w:p>
     <w:p>
@@ -3918,7 +3838,7 @@
           <w:noProof/>
         </w:rPr>
         <w:drawing>
-          <wp:inline distT="0" distB="0" distL="0" distR="0" wp14:anchorId="6978DA15" wp14:editId="5C533C2E">
+          <wp:inline distT="0" distB="0" distL="0" distR="0" wp14:anchorId="23C13084" wp14:editId="456EFDB6">
             <wp:extent cx="5943600" cy="3368040"/>
             <wp:effectExtent l="0" t="0" r="0" b="0"/>
             <wp:docPr id="3" name="Picture 3"/>
@@ -4257,7 +4177,7 @@
           <w:noProof/>
         </w:rPr>
         <w:drawing>
-          <wp:inline distT="0" distB="0" distL="0" distR="0" wp14:anchorId="0038A7C7" wp14:editId="18892276">
+          <wp:inline distT="0" distB="0" distL="0" distR="0" wp14:anchorId="4E080D14" wp14:editId="25EA8991">
             <wp:extent cx="5943600" cy="2080260"/>
             <wp:effectExtent l="0" t="0" r="0" b="0"/>
             <wp:docPr id="5" name="Picture 5"/>
@@ -4445,7 +4365,7 @@
           <w:sz w:val="20"/>
           <w:szCs w:val="20"/>
         </w:rPr>
-        <w:t xml:space="preserve"> (accuracy total / speed total): 140/142, 56/56, 347/353, 142/142. No subtest or total shows significant heterogeneity of the slope across CNVs after the plausibility screen (accuracy total </w:t>
+        <w:t xml:space="preserve"> (accuracy total / speed total): 140/142, 56/56, 347/353, 142/142. No subtest or total shows significant heterogeneity of the slope across CNVs (accuracy total </w:t>
       </w:r>
       <w:r>
         <w:rPr>
@@ -4511,7 +4431,7 @@
           <w:noProof/>
         </w:rPr>
         <w:drawing>
-          <wp:inline distT="0" distB="0" distL="0" distR="0" wp14:anchorId="5FFBBFF0" wp14:editId="57FF55CD">
+          <wp:inline distT="0" distB="0" distL="0" distR="0" wp14:anchorId="31AC363A" wp14:editId="36A90B8A">
             <wp:extent cx="5943600" cy="3452714"/>
             <wp:effectExtent l="0" t="0" r="0" b="0"/>
             <wp:docPr id="7" name="Picture 7"/>
@@ -4556,7 +4476,7 @@
           <w:noProof/>
         </w:rPr>
         <w:drawing>
-          <wp:inline distT="0" distB="0" distL="0" distR="0" wp14:anchorId="798B6FF0" wp14:editId="75523B8D">
+          <wp:inline distT="0" distB="0" distL="0" distR="0" wp14:anchorId="0E2C7704" wp14:editId="5ADE8BAD">
             <wp:extent cx="5943600" cy="3175969"/>
             <wp:effectExtent l="0" t="0" r="0" b="0"/>
             <wp:docPr id="9" name="Picture 9"/>
@@ -4819,7 +4739,7 @@
           <w:noProof/>
         </w:rPr>
         <w:drawing>
-          <wp:inline distT="0" distB="0" distL="0" distR="0" wp14:anchorId="6EC389AE" wp14:editId="5E85C2FB">
+          <wp:inline distT="0" distB="0" distL="0" distR="0" wp14:anchorId="26A140AB" wp14:editId="133AAB47">
             <wp:extent cx="5943600" cy="2060448"/>
             <wp:effectExtent l="0" t="0" r="0" b="0"/>
             <wp:docPr id="11" name="Picture 11"/>
@@ -8334,13 +8254,13 @@
       </w:pPr>
     </w:lvl>
   </w:abstractNum>
-  <w:num w:numId="1" w16cid:durableId="306597135">
+  <w:num w:numId="1" w16cid:durableId="1551645016">
     <w:abstractNumId w:val="1"/>
   </w:num>
-  <w:num w:numId="2" w16cid:durableId="1727800269">
+  <w:num w:numId="2" w16cid:durableId="221791052">
     <w:abstractNumId w:val="2"/>
   </w:num>
-  <w:num w:numId="3" w16cid:durableId="2041592107">
+  <w:num w:numId="3" w16cid:durableId="915091372">
     <w:abstractNumId w:val="0"/>
   </w:num>
 </w:numbering>

</xml_diff>